<commit_message>
Mark Rev C and Open Letter as filed; update site status to ready for submission
Removed "draft for public review" language from both DOCX source files and
regenerated PDFs. Updated index.html status badge to green / "Ready for
submission — June 15, 2026" and all document description lines to "Filed".

Co-Authored-By: Claude Sonnet 4.6 <noreply@anthropic.com>
</commit_message>
<xml_diff>
--- a/Open_Letter_to_Committee.docx
+++ b/Open_Letter_to_Committee.docx
@@ -38,7 +38,7 @@
           <w:sz w:val="22"/>
           <w:szCs w:val="22"/>
         </w:rPr>
-        <w:t xml:space="preserve">DRAFT FOR PUBLIC REVIEW — pending formal submission</w:t>
+        <w:t xml:space="preserve">FILED — JUNE 15, 2026</w:t>
       </w:r>
     </w:p>
     <w:p>
@@ -462,7 +462,7 @@
           <w:sz w:val="24"/>
           <w:szCs w:val="24"/>
         </w:rPr>
-        <w:t xml:space="preserve">This letter is filed separately from, and in addition to, the Public Record Statement (most recent revision dated June 15, 2026, currently in draft for public review). It is intended to enter the public record of the proceedings of the Wastewater Treatment Plant Site Selection Committee and to be made publicly available alongside the Public Record Statement during the community review period.</w:t>
+        <w:t xml:space="preserve">This letter is filed separately from, and in addition to, the Public Record Statement (most recent revision dated June 15, 2026, filed with the committee on June 15, 2026). It is intended to enter the public record of the proceedings of the Wastewater Treatment Plant Site Selection Committee and to be made publicly available alongside the Public Record Statement during the community review period.</w:t>
       </w:r>
     </w:p>
     <w:sectPr>

</xml_diff>

<commit_message>
Correct Open Letter filing status; mark Scoring Matrix PDF as filed
Open Letter to the Committee had not actually been filed; revert its
status to draft for public review. Rev C and the Scoring Matrix
Categories PDF were filed June 15 — mark the matrix PDF accordingly.

Co-Authored-By: Claude Sonnet 4.6 <noreply@anthropic.com>
</commit_message>
<xml_diff>
--- a/Open_Letter_to_Committee.docx
+++ b/Open_Letter_to_Committee.docx
@@ -38,7 +38,7 @@
           <w:sz w:val="22"/>
           <w:szCs w:val="22"/>
         </w:rPr>
-        <w:t xml:space="preserve">FILED — JUNE 15, 2026</w:t>
+        <w:t xml:space="preserve">DRAFT FOR PUBLIC REVIEW — pending formal submission</w:t>
       </w:r>
     </w:p>
     <w:p>
@@ -462,7 +462,7 @@
           <w:sz w:val="24"/>
           <w:szCs w:val="24"/>
         </w:rPr>
-        <w:t xml:space="preserve">This letter is filed separately from, and in addition to, the Public Record Statement (most recent revision dated June 15, 2026, filed with the committee on June 15, 2026). It is intended to enter the public record of the proceedings of the Wastewater Treatment Plant Site Selection Committee and to be made publicly available alongside the Public Record Statement during the community review period.</w:t>
+        <w:t xml:space="preserve">This letter is to be filed separately from, and in addition to, the Public Record Statement (most recent revision dated June 15, 2026, filed with the committee on June 15, 2026). It is intended to enter the public record of the proceedings of the Wastewater Treatment Plant Site Selection Committee and to be made publicly available alongside the Public Record Statement during the community review period.</w:t>
       </w:r>
     </w:p>
     <w:sectPr>

</xml_diff>